<commit_message>
Modificacion de prueba 1
</commit_message>
<xml_diff>
--- a/docs/quarto/reports/etapa1.docx
+++ b/docs/quarto/reports/etapa1.docx
@@ -37,19 +37,10 @@
     </w:p>
     <w:p>
       <w:pPr>
-        <w:pStyle w:val="SourceCode"/>
+        <w:pStyle w:val="FirstParagraph"/>
       </w:pPr>
       <w:r>
-        <w:rPr>
-          <w:rStyle w:val="FunctionTok"/>
-        </w:rPr>
-        <w:t xml:space="preserve">library</w:t>
-      </w:r>
-      <w:r>
-        <w:rPr>
-          <w:rStyle w:val="NormalTok"/>
-        </w:rPr>
-        <w:t xml:space="preserve">(tidyverse)</w:t>
+        <w:t xml:space="preserve">Test</w:t>
       </w:r>
     </w:p>
     <w:p>
@@ -58,90 +49,15 @@
       </w:pPr>
       <w:r>
         <w:rPr>
-          <w:rStyle w:val="VerbatimChar"/>
-        </w:rPr>
-        <w:t xml:space="preserve">── Attaching core tidyverse packages ──────────────────────── tidyverse 2.0.0 ──</w:t>
-      </w:r>
-      <w:r>
-        <w:br/>
-      </w:r>
-      <w:r>
-        <w:rPr>
-          <w:rStyle w:val="VerbatimChar"/>
-        </w:rPr>
-        <w:t xml:space="preserve">✔ dplyr     1.1.4     ✔ readr     2.1.5</w:t>
-      </w:r>
-      <w:r>
-        <w:br/>
-      </w:r>
-      <w:r>
-        <w:rPr>
-          <w:rStyle w:val="VerbatimChar"/>
-        </w:rPr>
-        <w:t xml:space="preserve">✔ forcats   1.0.1     ✔ stringr   1.5.2</w:t>
-      </w:r>
-      <w:r>
-        <w:br/>
-      </w:r>
-      <w:r>
-        <w:rPr>
-          <w:rStyle w:val="VerbatimChar"/>
-        </w:rPr>
-        <w:t xml:space="preserve">✔ ggplot2   4.0.0     ✔ tibble    3.3.0</w:t>
-      </w:r>
-      <w:r>
-        <w:br/>
-      </w:r>
-      <w:r>
-        <w:rPr>
-          <w:rStyle w:val="VerbatimChar"/>
-        </w:rPr>
-        <w:t xml:space="preserve">✔ lubridate 1.9.4     ✔ tidyr     1.3.1</w:t>
-      </w:r>
-      <w:r>
-        <w:br/>
-      </w:r>
-      <w:r>
-        <w:rPr>
-          <w:rStyle w:val="VerbatimChar"/>
-        </w:rPr>
-        <w:t xml:space="preserve">✔ purrr     1.1.0     </w:t>
-      </w:r>
-      <w:r>
-        <w:br/>
-      </w:r>
-      <w:r>
-        <w:rPr>
-          <w:rStyle w:val="VerbatimChar"/>
-        </w:rPr>
-        <w:t xml:space="preserve">── Conflicts ────────────────────────────────────────── tidyverse_conflicts() ──</w:t>
-      </w:r>
-      <w:r>
-        <w:br/>
-      </w:r>
-      <w:r>
-        <w:rPr>
-          <w:rStyle w:val="VerbatimChar"/>
-        </w:rPr>
-        <w:t xml:space="preserve">✖ dplyr::filter() masks stats::filter()</w:t>
-      </w:r>
-      <w:r>
-        <w:br/>
-      </w:r>
-      <w:r>
-        <w:rPr>
-          <w:rStyle w:val="VerbatimChar"/>
-        </w:rPr>
-        <w:t xml:space="preserve">✖ dplyr::lag()    masks stats::lag()</w:t>
-      </w:r>
-      <w:r>
-        <w:br/>
-      </w:r>
-      <w:r>
-        <w:rPr>
-          <w:rStyle w:val="VerbatimChar"/>
-        </w:rPr>
-        <w:t xml:space="preserve">ℹ Use the conflicted package (&lt;http://conflicted.r-lib.org/&gt;) to force all conflicts to become errors</w:t>
+          <w:rStyle w:val="FunctionTok"/>
+        </w:rPr>
+        <w:t xml:space="preserve">library</w:t>
+      </w:r>
+      <w:r>
+        <w:rPr>
+          <w:rStyle w:val="NormalTok"/>
+        </w:rPr>
+        <w:t xml:space="preserve">(tidyverse)</w:t>
       </w:r>
     </w:p>
     <w:p>
@@ -150,15 +66,90 @@
       </w:pPr>
       <w:r>
         <w:rPr>
-          <w:rStyle w:val="FunctionTok"/>
-        </w:rPr>
-        <w:t xml:space="preserve">library</w:t>
-      </w:r>
-      <w:r>
-        <w:rPr>
-          <w:rStyle w:val="NormalTok"/>
-        </w:rPr>
-        <w:t xml:space="preserve">(here)</w:t>
+          <w:rStyle w:val="VerbatimChar"/>
+        </w:rPr>
+        <w:t xml:space="preserve">── Attaching core tidyverse packages ──────────────────────── tidyverse 2.0.0 ──</w:t>
+      </w:r>
+      <w:r>
+        <w:br/>
+      </w:r>
+      <w:r>
+        <w:rPr>
+          <w:rStyle w:val="VerbatimChar"/>
+        </w:rPr>
+        <w:t xml:space="preserve">✔ dplyr     1.1.4     ✔ readr     2.1.5</w:t>
+      </w:r>
+      <w:r>
+        <w:br/>
+      </w:r>
+      <w:r>
+        <w:rPr>
+          <w:rStyle w:val="VerbatimChar"/>
+        </w:rPr>
+        <w:t xml:space="preserve">✔ forcats   1.0.1     ✔ stringr   1.5.2</w:t>
+      </w:r>
+      <w:r>
+        <w:br/>
+      </w:r>
+      <w:r>
+        <w:rPr>
+          <w:rStyle w:val="VerbatimChar"/>
+        </w:rPr>
+        <w:t xml:space="preserve">✔ ggplot2   4.0.0     ✔ tibble    3.3.0</w:t>
+      </w:r>
+      <w:r>
+        <w:br/>
+      </w:r>
+      <w:r>
+        <w:rPr>
+          <w:rStyle w:val="VerbatimChar"/>
+        </w:rPr>
+        <w:t xml:space="preserve">✔ lubridate 1.9.4     ✔ tidyr     1.3.1</w:t>
+      </w:r>
+      <w:r>
+        <w:br/>
+      </w:r>
+      <w:r>
+        <w:rPr>
+          <w:rStyle w:val="VerbatimChar"/>
+        </w:rPr>
+        <w:t xml:space="preserve">✔ purrr     1.1.0     </w:t>
+      </w:r>
+      <w:r>
+        <w:br/>
+      </w:r>
+      <w:r>
+        <w:rPr>
+          <w:rStyle w:val="VerbatimChar"/>
+        </w:rPr>
+        <w:t xml:space="preserve">── Conflicts ────────────────────────────────────────── tidyverse_conflicts() ──</w:t>
+      </w:r>
+      <w:r>
+        <w:br/>
+      </w:r>
+      <w:r>
+        <w:rPr>
+          <w:rStyle w:val="VerbatimChar"/>
+        </w:rPr>
+        <w:t xml:space="preserve">✖ dplyr::filter() masks stats::filter()</w:t>
+      </w:r>
+      <w:r>
+        <w:br/>
+      </w:r>
+      <w:r>
+        <w:rPr>
+          <w:rStyle w:val="VerbatimChar"/>
+        </w:rPr>
+        <w:t xml:space="preserve">✖ dplyr::lag()    masks stats::lag()</w:t>
+      </w:r>
+      <w:r>
+        <w:br/>
+      </w:r>
+      <w:r>
+        <w:rPr>
+          <w:rStyle w:val="VerbatimChar"/>
+        </w:rPr>
+        <w:t xml:space="preserve">ℹ Use the conflicted package (&lt;http://conflicted.r-lib.org/&gt;) to force all conflicts to become errors</w:t>
       </w:r>
     </w:p>
     <w:p>
@@ -167,9 +158,26 @@
       </w:pPr>
       <w:r>
         <w:rPr>
-          <w:rStyle w:val="VerbatimChar"/>
-        </w:rPr>
-        <w:t xml:space="preserve">here() starts at C:/Users/usuario/Downloads/GitHub/MA1001B</w:t>
+          <w:rStyle w:val="FunctionTok"/>
+        </w:rPr>
+        <w:t xml:space="preserve">library</w:t>
+      </w:r>
+      <w:r>
+        <w:rPr>
+          <w:rStyle w:val="NormalTok"/>
+        </w:rPr>
+        <w:t xml:space="preserve">(here)</w:t>
+      </w:r>
+    </w:p>
+    <w:p>
+      <w:pPr>
+        <w:pStyle w:val="SourceCode"/>
+      </w:pPr>
+      <w:r>
+        <w:rPr>
+          <w:rStyle w:val="VerbatimChar"/>
+        </w:rPr>
+        <w:t xml:space="preserve">here() starts at /Users/shirozmr/Documents/GitHub/MA1001B</w:t>
       </w:r>
     </w:p>
     <w:p>
@@ -4362,7 +4370,7 @@
         <w:rPr>
           <w:rStyle w:val="VerbatimChar"/>
         </w:rPr>
-        <w:t xml:space="preserve"> Median :1.000   Median : 16765   Median :1.000   Median :3.000  </w:t>
+        <w:t xml:space="preserve"> Median :1.000   Median : 16764   Median :1.000   Median :3.000  </w:t>
       </w:r>
       <w:r>
         <w:br/>
@@ -5965,7 +5973,11 @@
     </w:p>
     <w:bookmarkEnd w:id="24"/>
     <w:bookmarkEnd w:id="25"/>
-    <w:sectPr/>
+    <w:sectPr>
+      <w:footnotePr>
+        <w:numRestart w:val="eachSect"/>
+      </w:footnotePr>
+    </w:sectPr>
   </w:body>
 </w:document>
 </file>
@@ -6137,8 +6149,6 @@
     </w:pPr>
     <w:rPr>
       <w:rFonts w:asciiTheme="majorHAnsi" w:cstheme="majorBidi" w:eastAsiaTheme="majorEastAsia" w:hAnsiTheme="majorHAnsi"/>
-      <w:spacing w:val="-10"/>
-      <w:kern w:val="28"/>
       <w:sz w:val="56"/>
       <w:szCs w:val="56"/>
     </w:rPr>
@@ -6151,8 +6161,6 @@
     <w:rsid w:val="00A10FD9"/>
     <w:rPr>
       <w:rFonts w:asciiTheme="majorHAnsi" w:cstheme="majorBidi" w:eastAsiaTheme="majorEastAsia" w:hAnsiTheme="majorHAnsi"/>
-      <w:spacing w:val="-10"/>
-      <w:kern w:val="28"/>
       <w:sz w:val="56"/>
       <w:szCs w:val="56"/>
     </w:rPr>
@@ -6193,23 +6201,31 @@
   </w:style>
   <w:style w:customStyle="1" w:styleId="Author" w:type="paragraph">
     <w:name w:val="Author"/>
+    <w:basedOn w:val="Title"/>
     <w:next w:val="BodyText"/>
     <w:qFormat/>
     <w:pPr>
       <w:keepNext/>
       <w:keepLines/>
-      <w:jc w:val="center"/>
     </w:pPr>
+    <w:rPr>
+      <w:sz w:val="24"/>
+      <w:szCs w:val="24"/>
+    </w:rPr>
   </w:style>
   <w:style w:styleId="Date" w:type="paragraph">
     <w:name w:val="Date"/>
+    <w:basedOn w:val="Title"/>
     <w:next w:val="BodyText"/>
     <w:qFormat/>
     <w:pPr>
       <w:keepNext/>
       <w:keepLines/>
-      <w:jc w:val="center"/>
     </w:pPr>
+    <w:rPr>
+      <w:sz w:val="24"/>
+      <w:szCs w:val="24"/>
+    </w:rPr>
   </w:style>
   <w:style w:customStyle="1" w:styleId="AbstractTitle" w:type="paragraph">
     <w:name w:val="Abstract Title"/>

</xml_diff>